<commit_message>
Agrega integración con Gemini en silver
</commit_message>
<xml_diff>
--- a/docs/informe.docx
+++ b/docs/informe.docx
@@ -17,7 +17,21 @@
         <w:rPr>
           <w:lang w:val="es-ES"/>
         </w:rPr>
-        <w:t xml:space="preserve"> Configuración de estructura en VSC y Configuración en de SQLServer 2025.</w:t>
+        <w:t xml:space="preserve"> Configuración de estructura en VSC y Configuración en de </w:t>
+      </w:r>
+      <w:proofErr w:type="spellStart"/>
+      <w:r>
+        <w:rPr>
+          <w:lang w:val="es-ES"/>
+        </w:rPr>
+        <w:t>SQLServer</w:t>
+      </w:r>
+      <w:proofErr w:type="spellEnd"/>
+      <w:r>
+        <w:rPr>
+          <w:lang w:val="es-ES"/>
+        </w:rPr>
+        <w:t xml:space="preserve"> 2025.</w:t>
       </w:r>
     </w:p>
     <w:p>
@@ -249,6 +263,14 @@
           <w:lang w:val="es-ES"/>
         </w:rPr>
       </w:pPr>
+    </w:p>
+    <w:p>
+      <w:pPr>
+        <w:pStyle w:val="Prrafodelista"/>
+        <w:rPr>
+          <w:lang w:val="es-ES"/>
+        </w:rPr>
+      </w:pPr>
       <w:r>
         <w:rPr>
           <w:noProof/>
@@ -314,8 +336,16 @@
         <w:rPr>
           <w:lang w:val="es-ES"/>
         </w:rPr>
-        <w:t>Ahora vamos con BRONZE (crear bucket</w:t>
-      </w:r>
+        <w:t xml:space="preserve">Ahora vamos con BRONZE (crear </w:t>
+      </w:r>
+      <w:proofErr w:type="spellStart"/>
+      <w:r>
+        <w:rPr>
+          <w:lang w:val="es-ES"/>
+        </w:rPr>
+        <w:t>bucket</w:t>
+      </w:r>
+      <w:proofErr w:type="spellEnd"/>
       <w:r>
         <w:rPr>
           <w:lang w:val="es-ES"/>
@@ -549,7 +579,21 @@
         <w:rPr>
           <w:lang w:val="es-ES"/>
         </w:rPr>
-        <w:t>PASO 1: Crear credenciales (Service Account)</w:t>
+        <w:t xml:space="preserve">PASO 1: Crear credenciales (Service </w:t>
+      </w:r>
+      <w:proofErr w:type="spellStart"/>
+      <w:r>
+        <w:rPr>
+          <w:lang w:val="es-ES"/>
+        </w:rPr>
+        <w:t>Account</w:t>
+      </w:r>
+      <w:proofErr w:type="spellEnd"/>
+      <w:r>
+        <w:rPr>
+          <w:lang w:val="es-ES"/>
+        </w:rPr>
+        <w:t>)</w:t>
       </w:r>
     </w:p>
     <w:p>
@@ -812,11 +856,19 @@
           <w:lang w:val="es-ES"/>
         </w:rPr>
       </w:pPr>
-      <w:r>
-        <w:rPr>
-          <w:lang w:val="es-ES"/>
-        </w:rPr>
-        <w:t xml:space="preserve">Dfdf </w:t>
+      <w:proofErr w:type="spellStart"/>
+      <w:r>
+        <w:rPr>
+          <w:lang w:val="es-ES"/>
+        </w:rPr>
+        <w:t>Dfdf</w:t>
+      </w:r>
+      <w:proofErr w:type="spellEnd"/>
+      <w:r>
+        <w:rPr>
+          <w:lang w:val="es-ES"/>
+        </w:rPr>
+        <w:t xml:space="preserve"> </w:t>
       </w:r>
     </w:p>
     <w:p>
@@ -856,8 +908,16 @@
           <w:lang w:val="es-ES"/>
         </w:rPr>
         <w:lastRenderedPageBreak/>
-        <w:t>Etapa de SILVER - Habilitar la Api de BigQuery</w:t>
-      </w:r>
+        <w:t xml:space="preserve">Etapa de SILVER - Habilitar la Api de </w:t>
+      </w:r>
+      <w:proofErr w:type="spellStart"/>
+      <w:r>
+        <w:rPr>
+          <w:lang w:val="es-ES"/>
+        </w:rPr>
+        <w:t>BigQuery</w:t>
+      </w:r>
+      <w:proofErr w:type="spellEnd"/>
     </w:p>
     <w:p>
       <w:pPr>
@@ -935,8 +995,16 @@
         <w:rPr>
           <w:lang w:val="es-ES"/>
         </w:rPr>
-        <w:t>Permisos en IAM - BigQuery</w:t>
-      </w:r>
+        <w:t xml:space="preserve">Permisos en IAM - </w:t>
+      </w:r>
+      <w:proofErr w:type="spellStart"/>
+      <w:r>
+        <w:rPr>
+          <w:lang w:val="es-ES"/>
+        </w:rPr>
+        <w:t>BigQuery</w:t>
+      </w:r>
+      <w:proofErr w:type="spellEnd"/>
     </w:p>
     <w:p>
       <w:pPr>
@@ -1006,7 +1074,21 @@
         <w:rPr>
           <w:lang w:val="es-ES"/>
         </w:rPr>
-        <w:t>Crear el dateset o conjunto de datos</w:t>
+        <w:t xml:space="preserve">Crear el </w:t>
+      </w:r>
+      <w:proofErr w:type="spellStart"/>
+      <w:r>
+        <w:rPr>
+          <w:lang w:val="es-ES"/>
+        </w:rPr>
+        <w:t>dateset</w:t>
+      </w:r>
+      <w:proofErr w:type="spellEnd"/>
+      <w:r>
+        <w:rPr>
+          <w:lang w:val="es-ES"/>
+        </w:rPr>
+        <w:t xml:space="preserve"> o conjunto de datos</w:t>
       </w:r>
     </w:p>
     <w:p>
@@ -1078,18 +1160,27 @@
         <w:t xml:space="preserve">Habilitar </w:t>
       </w:r>
       <w:r>
-        <w:t>Cloud Document AI API</w:t>
-      </w:r>
-    </w:p>
-    <w:p>
-      <w:pPr>
-        <w:pStyle w:val="Prrafodelista"/>
-        <w:rPr>
-          <w:lang w:val="es-ES"/>
-        </w:rPr>
-      </w:pPr>
-      <w:r>
-        <w:rPr>
+        <w:t xml:space="preserve">Cloud </w:t>
+      </w:r>
+      <w:proofErr w:type="spellStart"/>
+      <w:r>
+        <w:t>Document</w:t>
+      </w:r>
+      <w:proofErr w:type="spellEnd"/>
+      <w:r>
+        <w:t xml:space="preserve"> AI API</w:t>
+      </w:r>
+    </w:p>
+    <w:p>
+      <w:pPr>
+        <w:pStyle w:val="Prrafodelista"/>
+        <w:rPr>
+          <w:lang w:val="es-ES"/>
+        </w:rPr>
+      </w:pPr>
+      <w:r>
+        <w:rPr>
+          <w:noProof/>
           <w:lang w:val="es-ES"/>
         </w:rPr>
         <w:drawing>
@@ -1154,6 +1245,7 @@
       </w:pPr>
       <w:r>
         <w:rPr>
+          <w:noProof/>
           <w:lang w:val="es-ES"/>
         </w:rPr>
         <w:drawing>
@@ -1208,17 +1300,19 @@
           <w:lang w:val="pt-BR"/>
         </w:rPr>
       </w:pPr>
+      <w:proofErr w:type="spellStart"/>
       <w:r>
         <w:rPr>
           <w:lang w:val="pt-BR"/>
         </w:rPr>
-        <w:t>Clasificador de documentos</w:t>
-      </w:r>
+        <w:t>Clasificador</w:t>
+      </w:r>
+      <w:proofErr w:type="spellEnd"/>
       <w:r>
         <w:rPr>
           <w:lang w:val="pt-BR"/>
         </w:rPr>
-        <w:t xml:space="preserve"> = </w:t>
+        <w:t xml:space="preserve"> de documentos</w:t>
       </w:r>
       <w:r>
         <w:rPr>
@@ -1226,22 +1320,45 @@
         </w:rPr>
         <w:t xml:space="preserve"> </w:t>
       </w:r>
+      <w:proofErr w:type="gramStart"/>
       <w:r>
         <w:rPr>
           <w:lang w:val="pt-BR"/>
         </w:rPr>
-        <w:t>Custom Classifier</w:t>
-      </w:r>
-    </w:p>
-    <w:p>
-      <w:pPr>
-        <w:pStyle w:val="Prrafodelista"/>
-        <w:rPr>
-          <w:lang w:val="es-ES"/>
-        </w:rPr>
-      </w:pPr>
-      <w:r>
-        <w:rPr>
+        <w:t xml:space="preserve">= </w:t>
+      </w:r>
+      <w:r>
+        <w:rPr>
+          <w:lang w:val="pt-BR"/>
+        </w:rPr>
+        <w:t xml:space="preserve"> Custom</w:t>
+      </w:r>
+      <w:proofErr w:type="gramEnd"/>
+      <w:r>
+        <w:rPr>
+          <w:lang w:val="pt-BR"/>
+        </w:rPr>
+        <w:t xml:space="preserve"> </w:t>
+      </w:r>
+      <w:proofErr w:type="spellStart"/>
+      <w:r>
+        <w:rPr>
+          <w:lang w:val="pt-BR"/>
+        </w:rPr>
+        <w:t>Classifier</w:t>
+      </w:r>
+      <w:proofErr w:type="spellEnd"/>
+    </w:p>
+    <w:p>
+      <w:pPr>
+        <w:pStyle w:val="Prrafodelista"/>
+        <w:rPr>
+          <w:lang w:val="es-ES"/>
+        </w:rPr>
+      </w:pPr>
+      <w:r>
+        <w:rPr>
+          <w:noProof/>
           <w:lang w:val="es-ES"/>
         </w:rPr>
         <w:drawing>
@@ -1296,15 +1413,23 @@
       <w:r>
         <w:t xml:space="preserve"> de documentos = </w:t>
       </w:r>
-      <w:r>
-        <w:t>Custom Extractor</w:t>
-      </w:r>
-    </w:p>
-    <w:p>
-      <w:pPr>
-        <w:pStyle w:val="Prrafodelista"/>
-      </w:pPr>
-      <w:r>
+      <w:proofErr w:type="spellStart"/>
+      <w:r>
+        <w:t>Custom</w:t>
+      </w:r>
+      <w:proofErr w:type="spellEnd"/>
+      <w:r>
+        <w:t xml:space="preserve"> Extractor</w:t>
+      </w:r>
+    </w:p>
+    <w:p>
+      <w:pPr>
+        <w:pStyle w:val="Prrafodelista"/>
+      </w:pPr>
+      <w:r>
+        <w:rPr>
+          <w:noProof/>
+        </w:rPr>
         <w:lastRenderedPageBreak/>
         <w:drawing>
           <wp:inline distT="0" distB="0" distL="0" distR="0" wp14:anchorId="7AC5D177" wp14:editId="2671AF85">
@@ -2168,6 +2293,7 @@
   <w:style w:type="character" w:default="1" w:styleId="Fuentedeprrafopredeter">
     <w:name w:val="Default Paragraph Font"/>
     <w:uiPriority w:val="1"/>
+    <w:semiHidden/>
     <w:unhideWhenUsed/>
   </w:style>
   <w:style w:type="table" w:default="1" w:styleId="Tablanormal">

</xml_diff>